<commit_message>
Finalize JMM pre-submission package
</commit_message>
<xml_diff>
--- a/manuscript/JMM-MANUSCRIPT-AUTHOR-REVIEW-DRAFT.docx
+++ b/manuscript/JMM-MANUSCRIPT-AUTHOR-REVIEW-DRAFT.docx
@@ -58,7 +58,7 @@
           <w:rFonts w:ascii="Times New Roman" w:hAnsi="Times New Roman"/>
           <w:sz w:val="20"/>
         </w:rPr>
-        <w:t>\*Corresponding author: andres.monreal@ues.mx</w:t>
+        <w:t>*Corresponding author: andres.monreal@ues.mx</w:t>
       </w:r>
     </w:p>
     <w:p>
@@ -268,6 +268,21 @@
         <w:t>The original DUD-E PDB condition produced no nonempty PDBQT outputs: all 102 attempts failed, and the retained audit recorded blank PDB element fields in all observed coordinate records. The RCSB mmCIF condition produced 26 direct successes and 76 failures. The RCSB legacy-PDB condition produced 27 direct successes and 75 failures (Table 1; Fig. 1).</w:t>
       </w:r>
     </w:p>
+    <w:p>
+      <w:r>
+        <w:br w:type="page"/>
+      </w:r>
+    </w:p>
+    <w:p>
+      <w:r>
+        <w:rPr>
+          <w:rFonts w:ascii="Times New Roman" w:hAnsi="Times New Roman"/>
+          <w:b/>
+          <w:sz w:val="20"/>
+        </w:rPr>
+        <w:t>Table 1 Strict direct receptor-preparation outcomes by source-and-reader condition</w:t>
+      </w:r>
+    </w:p>
     <w:tbl>
       <w:tblPr>
         <w:tblStyle w:val="TableGrid"/>
@@ -283,6 +298,10 @@
         <w:gridCol w:w="2340"/>
       </w:tblGrid>
       <w:tr>
+        <w:trPr>
+          <w:cantSplit/>
+          <w:tblHeader w:val="true"/>
+        </w:trPr>
         <w:tc>
           <w:tcPr>
             <w:tcW w:type="dxa" w:w="2340"/>
@@ -353,6 +372,9 @@
         </w:tc>
       </w:tr>
       <w:tr>
+        <w:trPr>
+          <w:cantSplit/>
+        </w:trPr>
         <w:tc>
           <w:tcPr>
             <w:tcW w:type="dxa" w:w="2340"/>
@@ -423,6 +445,9 @@
         </w:tc>
       </w:tr>
       <w:tr>
+        <w:trPr>
+          <w:cantSplit/>
+        </w:trPr>
         <w:tc>
           <w:tcPr>
             <w:tcW w:type="dxa" w:w="2340"/>
@@ -493,6 +518,9 @@
         </w:tc>
       </w:tr>
       <w:tr>
+        <w:trPr>
+          <w:cantSplit/>
+        </w:trPr>
         <w:tc>
           <w:tcPr>
             <w:tcW w:type="dxa" w:w="2340"/>
@@ -590,6 +618,15 @@
         <w:t>All nine generated poses were retained for each reference case (Table 2; Fig. 2). For BRAF 3D4Q/SM5, the top-score pose had a mapped heavy-atom RMSD of 1.134 Å and the lowest observed RMSD was 1.083 Å. For KIF11 3CJO/K30, the top-score pose had RMSD 1.477 Å and the lowest observed RMSD was 1.316 Å.</w:t>
       </w:r>
     </w:p>
+    <w:p>
+      <w:r>
+        <w:rPr>
+          <w:rFonts w:ascii="Times New Roman" w:hAnsi="Times New Roman"/>
+          <w:sz w:val="20"/>
+        </w:rPr>
+        <w:t>Table 2 Retained reference-pose recovery outcomes under declared configurations</w:t>
+      </w:r>
+    </w:p>
     <w:tbl>
       <w:tblPr>
         <w:tblStyle w:val="TableGrid"/>
@@ -607,6 +644,10 @@
         <w:gridCol w:w="1560"/>
       </w:tblGrid>
       <w:tr>
+        <w:trPr>
+          <w:cantSplit/>
+          <w:tblHeader w:val="true"/>
+        </w:trPr>
         <w:tc>
           <w:tcPr>
             <w:tcW w:type="dxa" w:w="1560"/>
@@ -711,6 +752,9 @@
         </w:tc>
       </w:tr>
       <w:tr>
+        <w:trPr>
+          <w:cantSplit/>
+        </w:trPr>
         <w:tc>
           <w:tcPr>
             <w:tcW w:type="dxa" w:w="1560"/>
@@ -815,6 +859,9 @@
         </w:tc>
       </w:tr>
       <w:tr>
+        <w:trPr>
+          <w:cantSplit/>
+        </w:trPr>
         <w:tc>
           <w:tcPr>
             <w:tcW w:type="dxa" w:w="1560"/>
@@ -1088,7 +1135,7 @@
           <w:rFonts w:ascii="Times New Roman" w:hAnsi="Times New Roman"/>
           <w:sz w:val="20"/>
         </w:rPr>
-        <w:t>Versioned code, derived non-coordinate result tables, protocols, validation artefacts, and deterministic figures are available from the project repository and its versioned Zenodo archive. Original coordinates and local PDBQT/log files are not redistributed; source identifiers, URLs, and checksums are provided to support retrieval and verification.</w:t>
+        <w:t>Versioned code, derived non-coordinate result tables, protocols, validation artefacts, and deterministic figures are available from the public project repository. The frozen v0.2.0 evidence archive is available at https://doi.org/10.5281/zenodo.21866318. A new persistent archive containing the comparator and manuscript-source version must be created before submission. Original coordinates and local PDBQT/log files are not redistributed; source identifiers, URLs, and checksums are provided to support retrieval and verification.</w:t>
       </w:r>
     </w:p>
     <w:p>
@@ -1243,7 +1290,7 @@
           <w:rFonts w:ascii="Times New Roman" w:hAnsi="Times New Roman"/>
           <w:sz w:val="18"/>
         </w:rPr>
-        <w:t>Figure files for separate upload: reports/figures/figure-6-preparation-comparator.svg and reports/figures/figure-5-braf-sm5-pose-recovery.svg.</w:t>
+        <w:t>Figure files for separate upload: reports/figures/figure-6-preparation-comparator.svg and reports/figures/figure-7-reference-pose-panel.svg.</w:t>
       </w:r>
     </w:p>
     <w:sectPr>

</xml_diff>